<commit_message>
Add persistent Windows restore recovery
Preserve restore inputs and verified safety backups, journal replacement phases, and block normal startup and backups after an interrupted restore. Add explicit launcher recovery choices, protect recovery archives from cloud overwrite, and expand documentation and recovery checks.
</commit_message>
<xml_diff>
--- a/docs/user-guides/windows/05-RecoverOrchidAppOnReplacementWindowsComputer.docx
+++ b/docs/user-guides/windows/05-RecoverOrchidAppOnReplacementWindowsComputer.docx
@@ -393,7 +393,7 @@
         <w:pStyle w:val="ListNumber"/>
       </w:pPr>
       <w:r>
-        <w:t>Confirm the restore warning.</w:t>
+        <w:t>Confirm the restore warning. A verified safety backup is required before replacement.</w:t>
       </w:r>
     </w:p>
     <w:p>
@@ -731,7 +731,7 @@
     </w:p>
     <w:p>
       <w:r>
-        <w:t>This starts the recovery process.</w:t>
+        <w:t>The launcher retains the selected ZIP and creates a safety backup of the current collection before replacement. If either fails, replacement stops.</w:t>
       </w:r>
     </w:p>
     <w:p>
@@ -1116,7 +1116,7 @@
     </w:p>
     <w:p>
       <w:r>
-        <w:t>Stop using the restored data. Preserve the source ZIP and launcher log, then obtain support before retrying a partial or failed recovery.</w:t>
+        <w:t>If restore fails after replacement starts, normal startup and backups are blocked. Select Restore from backup: Yes restores the retained input; No restores the original safety backup; Cancel leaves the files for support. Do not delete recovery files or retry blindly.</w:t>
       </w:r>
     </w:p>
     <w:p>
@@ -1350,7 +1350,7 @@
         <w:pStyle w:val="ListBullet"/>
       </w:pPr>
       <w:r>
-        <w:t>After recovery, configure cloud backup again so future backups are copied to the cloud folder.</w:t>
+        <w:t>After checking recovery, choose a different cloud folder if the old fixed-name ZIP was selected for restore. OrchidApp protects that selected path from later cloud copies.</w:t>
       </w:r>
     </w:p>
     <w:p>
@@ -1561,7 +1561,7 @@
           </w:tcPr>
           <w:p>
             <w:r>
-              <w:t>Closing a browser tab does not control restore availability. Wait for a ready launcher; after failure, preserve the ZIP/log and seek support before retrying.</w:t>
+              <w:t>Closing a browser tab does not control restore availability. After interruption, use the launcher recovery choice. If recovery files cannot be read, preserve the ZIP/log and seek support.</w:t>
             </w:r>
           </w:p>
         </w:tc>

</xml_diff>

<commit_message>
Add persistent Windows restore recovery (#347)
Preserve restore inputs and verified safety backups, journal replacement phases, and block normal startup and backups after an interrupted restore. Add explicit launcher recovery choices, protect recovery archives from cloud overwrite, and expand documentation and recovery checks.
</commit_message>
<xml_diff>
--- a/docs/user-guides/windows/05-RecoverOrchidAppOnReplacementWindowsComputer.docx
+++ b/docs/user-guides/windows/05-RecoverOrchidAppOnReplacementWindowsComputer.docx
@@ -393,7 +393,7 @@
         <w:pStyle w:val="ListNumber"/>
       </w:pPr>
       <w:r>
-        <w:t>Confirm the restore warning.</w:t>
+        <w:t>Confirm the restore warning. A verified safety backup is required before replacement.</w:t>
       </w:r>
     </w:p>
     <w:p>
@@ -731,7 +731,7 @@
     </w:p>
     <w:p>
       <w:r>
-        <w:t>This starts the recovery process.</w:t>
+        <w:t>The launcher retains the selected ZIP and creates a safety backup of the current collection before replacement. If either fails, replacement stops.</w:t>
       </w:r>
     </w:p>
     <w:p>
@@ -1116,7 +1116,7 @@
     </w:p>
     <w:p>
       <w:r>
-        <w:t>Stop using the restored data. Preserve the source ZIP and launcher log, then obtain support before retrying a partial or failed recovery.</w:t>
+        <w:t>If restore fails after replacement starts, normal startup and backups are blocked. Select Restore from backup: Yes restores the retained input; No restores the original safety backup; Cancel leaves the files for support. Do not delete recovery files or retry blindly.</w:t>
       </w:r>
     </w:p>
     <w:p>
@@ -1350,7 +1350,7 @@
         <w:pStyle w:val="ListBullet"/>
       </w:pPr>
       <w:r>
-        <w:t>After recovery, configure cloud backup again so future backups are copied to the cloud folder.</w:t>
+        <w:t>After checking recovery, choose a different cloud folder if the old fixed-name ZIP was selected for restore. OrchidApp protects that selected path from later cloud copies.</w:t>
       </w:r>
     </w:p>
     <w:p>
@@ -1561,7 +1561,7 @@
           </w:tcPr>
           <w:p>
             <w:r>
-              <w:t>Closing a browser tab does not control restore availability. Wait for a ready launcher; after failure, preserve the ZIP/log and seek support before retrying.</w:t>
+              <w:t>Closing a browser tab does not control restore availability. After interruption, use the launcher recovery choice. If recovery files cannot be read, preserve the ZIP/log and seek support.</w:t>
             </w:r>
           </w:p>
         </w:tc>

</xml_diff>